<commit_message>
prints do aks, doc regerado e cluster com 2 nos
</commit_message>
<xml_diff>
--- a/docs/HidroSense-Documentacao.docx
+++ b/docs/HidroSense-Documentacao.docx
@@ -2726,6 +2726,25 @@
     </w:p>
     <w:p>
       <w:pPr>
+        <w:pStyle w:val="Heading1"/>
+        <w:pageBreakBefore/>
+      </w:pPr>
+      <w:r>
+        <w:t xml:space="preserve">5 EVIDÊNCIAS DOS AMBIENTES</w:t>
+      </w:r>
+    </w:p>
+    <w:p>
+      <w:pPr>
+        <w:spacing w:line="360" w:after="0"/>
+        <w:ind w:firstLine="709"/>
+        <w:jc w:val="both"/>
+      </w:pPr>
+      <w:r>
+        <w:t xml:space="preserve">As figuras a seguir mostram o deploy no AKS, a API em funcionamento e os recursos provisionados na Azure.</w:t>
+      </w:r>
+    </w:p>
+    <w:p>
+      <w:pPr>
         <w:keepNext/>
         <w:spacing w:before="240" w:line="240" w:after="60"/>
         <w:jc w:val="center"/>
@@ -2735,76 +2754,7 @@
           <w:sz w:val="20"/>
           <w:szCs w:val="20"/>
         </w:rPr>
-        <w:t xml:space="preserve">Figura 5 – Imagem publicada no GitHub Container Registry</w:t>
-      </w:r>
-    </w:p>
-    <w:p>
-      <w:pPr>
-        <w:keepNext/>
-        <w:pBdr>
-          <w:top w:val="dashed" w:color="808080" w:sz="8" w:space="8"/>
-          <w:bottom w:val="dashed" w:color="808080" w:sz="8" w:space="8"/>
-          <w:left w:val="dashed" w:color="808080" w:sz="8" w:space="8"/>
-          <w:right w:val="dashed" w:color="808080" w:sz="8" w:space="8"/>
-        </w:pBdr>
-        <w:spacing w:line="1800" w:lineRule="exact"/>
-        <w:jc w:val="center"/>
-      </w:pPr>
-      <w:r>
-        <w:rPr>
-          <w:i/>
-          <w:iCs/>
-          <w:color w:val="808080"/>
-          <w:sz w:val="20"/>
-          <w:szCs w:val="20"/>
-        </w:rPr>
-        <w:t xml:space="preserve">[ inserir print: docs/prints/03-imagem-ghcr.png ]</w:t>
-      </w:r>
-    </w:p>
-    <w:p>
-      <w:pPr>
-        <w:spacing w:before="60" w:line="240" w:after="240"/>
-        <w:jc w:val="center"/>
-      </w:pPr>
-      <w:r>
-        <w:rPr>
-          <w:sz w:val="20"/>
-          <w:szCs w:val="20"/>
-        </w:rPr>
-        <w:t xml:space="preserve">Fonte: elaborado pelos autores (2026).</w:t>
-      </w:r>
-    </w:p>
-    <w:p>
-      <w:pPr>
-        <w:pStyle w:val="Heading1"/>
-        <w:pageBreakBefore/>
-      </w:pPr>
-      <w:r>
-        <w:t xml:space="preserve">5 EVIDÊNCIAS DOS AMBIENTES</w:t>
-      </w:r>
-    </w:p>
-    <w:p>
-      <w:pPr>
-        <w:spacing w:line="360" w:after="0"/>
-        <w:ind w:firstLine="709"/>
-        <w:jc w:val="both"/>
-      </w:pPr>
-      <w:r>
-        <w:t xml:space="preserve">As figuras a seguir mostram o deploy e os dois ambientes em funcionamento.</w:t>
-      </w:r>
-    </w:p>
-    <w:p>
-      <w:pPr>
-        <w:keepNext/>
-        <w:spacing w:before="240" w:line="240" w:after="60"/>
-        <w:jc w:val="center"/>
-      </w:pPr>
-      <w:r>
-        <w:rPr>
-          <w:sz w:val="20"/>
-          <w:szCs w:val="20"/>
-        </w:rPr>
-        <w:t xml:space="preserve">Figura 6 – Deploy em staging com rollout e smoke test</w:t>
+        <w:t xml:space="preserve">Figura 5 – Deploy em staging no AKS com rollout e smoke test</w:t>
       </w:r>
     </w:p>
     <w:p>
@@ -2815,9 +2765,9 @@
       <w:r>
         <w:drawing>
           <wp:inline distT="0" distB="0" distL="0" distR="0">
-            <wp:extent cx="5715000" cy="3228975"/>
+            <wp:extent cx="5715000" cy="2914650"/>
             <wp:effectExtent t="0" r="0" b="0" l="0"/>
-            <wp:docPr id="1" name="04-deploy-staging" descr="Deploy em staging com rollout e smoke test" title="Deploy em staging com rollout e smoke test"/>
+            <wp:docPr id="1" name="04-deploy-staging" descr="Deploy em staging no AKS com rollout e smoke test" title="Deploy em staging no AKS com rollout e smoke test"/>
             <wp:cNvGraphicFramePr>
               <a:graphicFrameLocks xmlns:a="http://schemas.openxmlformats.org/drawingml/2006/main" noChangeAspect="1"/>
             </wp:cNvGraphicFramePr>
@@ -2840,7 +2790,7 @@
                   <pic:spPr bwMode="auto">
                     <a:xfrm>
                       <a:off x="0" y="0"/>
-                      <a:ext cx="5715000" cy="3228975"/>
+                      <a:ext cx="5715000" cy="2914650"/>
                     </a:xfrm>
                     <a:prstGeom prst="rect">
                       <a:avLst/>
@@ -2877,7 +2827,7 @@
           <w:sz w:val="20"/>
           <w:szCs w:val="20"/>
         </w:rPr>
-        <w:t xml:space="preserve">Figura 7 – Deploy em produção com rollout e smoke test</w:t>
+        <w:t xml:space="preserve">Figura 6 – Staging no ar: Swagger da API</w:t>
       </w:r>
     </w:p>
     <w:p>
@@ -2888,9 +2838,9 @@
       <w:r>
         <w:drawing>
           <wp:inline distT="0" distB="0" distL="0" distR="0">
-            <wp:extent cx="5715000" cy="3200400"/>
+            <wp:extent cx="5715000" cy="3057525"/>
             <wp:effectExtent t="0" r="0" b="0" l="0"/>
-            <wp:docPr id="1" name="05-deploy-producao" descr="Deploy em produção com rollout e smoke test" title="Deploy em produção com rollout e smoke test"/>
+            <wp:docPr id="1" name="07-staging-swagger" descr="Staging no ar: Swagger da API" title="Staging no ar: Swagger da API"/>
             <wp:cNvGraphicFramePr>
               <a:graphicFrameLocks xmlns:a="http://schemas.openxmlformats.org/drawingml/2006/main" noChangeAspect="1"/>
             </wp:cNvGraphicFramePr>
@@ -2913,7 +2863,7 @@
                   <pic:spPr bwMode="auto">
                     <a:xfrm>
                       <a:off x="0" y="0"/>
-                      <a:ext cx="5715000" cy="3200400"/>
+                      <a:ext cx="5715000" cy="3057525"/>
                     </a:xfrm>
                     <a:prstGeom prst="rect">
                       <a:avLst/>
@@ -2950,35 +2900,72 @@
           <w:sz w:val="20"/>
           <w:szCs w:val="20"/>
         </w:rPr>
-        <w:t xml:space="preserve">Figura 8 – Recursos dos dois namespaces no cluster</w:t>
+        <w:t xml:space="preserve">Figura 7 – Resource group hidrosense-rg em Chile Central</w:t>
       </w:r>
     </w:p>
     <w:p>
       <w:pPr>
         <w:keepNext/>
-        <w:pBdr>
-          <w:top w:val="dashed" w:color="808080" w:sz="8" w:space="8"/>
-          <w:bottom w:val="dashed" w:color="808080" w:sz="8" w:space="8"/>
-          <w:left w:val="dashed" w:color="808080" w:sz="8" w:space="8"/>
-          <w:right w:val="dashed" w:color="808080" w:sz="8" w:space="8"/>
-        </w:pBdr>
-        <w:spacing w:line="1800" w:lineRule="exact"/>
-        <w:jc w:val="center"/>
-      </w:pPr>
-      <w:r>
-        <w:rPr>
-          <w:i/>
-          <w:iCs/>
-          <w:color w:val="808080"/>
+        <w:jc w:val="center"/>
+      </w:pPr>
+      <w:r>
+        <w:drawing>
+          <wp:inline distT="0" distB="0" distL="0" distR="0">
+            <wp:extent cx="5715000" cy="4076700"/>
+            <wp:effectExtent t="0" r="0" b="0" l="0"/>
+            <wp:docPr id="1" name="09-azure-resource-group" descr="Resource group hidrosense-rg em Chile Central" title="Resource group hidrosense-rg em Chile Central"/>
+            <wp:cNvGraphicFramePr>
+              <a:graphicFrameLocks xmlns:a="http://schemas.openxmlformats.org/drawingml/2006/main" noChangeAspect="1"/>
+            </wp:cNvGraphicFramePr>
+            <a:graphic xmlns:a="http://schemas.openxmlformats.org/drawingml/2006/main">
+              <a:graphicData uri="http://schemas.openxmlformats.org/drawingml/2006/picture">
+                <pic:pic xmlns:pic="http://schemas.openxmlformats.org/drawingml/2006/picture">
+                  <pic:nvPicPr>
+                    <pic:cNvPr id="0" name="" descr=""/>
+                    <pic:cNvPicPr>
+                      <a:picLocks noChangeAspect="1" noChangeArrowheads="1"/>
+                    </pic:cNvPicPr>
+                  </pic:nvPicPr>
+                  <pic:blipFill>
+                    <a:blip r:embed="rId12" cstate="none"/>
+                    <a:srcRect/>
+                    <a:stretch>
+                      <a:fillRect/>
+                    </a:stretch>
+                  </pic:blipFill>
+                  <pic:spPr bwMode="auto">
+                    <a:xfrm>
+                      <a:off x="0" y="0"/>
+                      <a:ext cx="5715000" cy="4076700"/>
+                    </a:xfrm>
+                    <a:prstGeom prst="rect">
+                      <a:avLst/>
+                    </a:prstGeom>
+                  </pic:spPr>
+                </pic:pic>
+              </a:graphicData>
+            </a:graphic>
+          </wp:inline>
+        </w:drawing>
+      </w:r>
+    </w:p>
+    <w:p>
+      <w:pPr>
+        <w:spacing w:before="60" w:line="240" w:after="240"/>
+        <w:jc w:val="center"/>
+      </w:pPr>
+      <w:r>
+        <w:rPr>
           <w:sz w:val="20"/>
           <w:szCs w:val="20"/>
         </w:rPr>
-        <w:t xml:space="preserve">[ inserir print: docs/prints/06-kubectl-ambientes.png ]</w:t>
-      </w:r>
-    </w:p>
-    <w:p>
-      <w:pPr>
-        <w:spacing w:before="60" w:line="240" w:after="240"/>
+        <w:t xml:space="preserve">Fonte: elaborado pelos autores (2026).</w:t>
+      </w:r>
+    </w:p>
+    <w:p>
+      <w:pPr>
+        <w:keepNext/>
+        <w:spacing w:before="240" w:line="240" w:after="60"/>
         <w:jc w:val="center"/>
       </w:pPr>
       <w:r>
@@ -2986,6 +2973,65 @@
           <w:sz w:val="20"/>
           <w:szCs w:val="20"/>
         </w:rPr>
+        <w:t xml:space="preserve">Figura 8 – Cluster AKS hidrosense-aks: visão geral</w:t>
+      </w:r>
+    </w:p>
+    <w:p>
+      <w:pPr>
+        <w:keepNext/>
+        <w:jc w:val="center"/>
+      </w:pPr>
+      <w:r>
+        <w:drawing>
+          <wp:inline distT="0" distB="0" distL="0" distR="0">
+            <wp:extent cx="5715000" cy="2924175"/>
+            <wp:effectExtent t="0" r="0" b="0" l="0"/>
+            <wp:docPr id="1" name="10-aks-visao-geral" descr="Cluster AKS hidrosense-aks: visão geral" title="Cluster AKS hidrosense-aks: visão geral"/>
+            <wp:cNvGraphicFramePr>
+              <a:graphicFrameLocks xmlns:a="http://schemas.openxmlformats.org/drawingml/2006/main" noChangeAspect="1"/>
+            </wp:cNvGraphicFramePr>
+            <a:graphic xmlns:a="http://schemas.openxmlformats.org/drawingml/2006/main">
+              <a:graphicData uri="http://schemas.openxmlformats.org/drawingml/2006/picture">
+                <pic:pic xmlns:pic="http://schemas.openxmlformats.org/drawingml/2006/picture">
+                  <pic:nvPicPr>
+                    <pic:cNvPr id="0" name="" descr=""/>
+                    <pic:cNvPicPr>
+                      <a:picLocks noChangeAspect="1" noChangeArrowheads="1"/>
+                    </pic:cNvPicPr>
+                  </pic:nvPicPr>
+                  <pic:blipFill>
+                    <a:blip r:embed="rId13" cstate="none"/>
+                    <a:srcRect/>
+                    <a:stretch>
+                      <a:fillRect/>
+                    </a:stretch>
+                  </pic:blipFill>
+                  <pic:spPr bwMode="auto">
+                    <a:xfrm>
+                      <a:off x="0" y="0"/>
+                      <a:ext cx="5715000" cy="2924175"/>
+                    </a:xfrm>
+                    <a:prstGeom prst="rect">
+                      <a:avLst/>
+                    </a:prstGeom>
+                  </pic:spPr>
+                </pic:pic>
+              </a:graphicData>
+            </a:graphic>
+          </wp:inline>
+        </w:drawing>
+      </w:r>
+    </w:p>
+    <w:p>
+      <w:pPr>
+        <w:spacing w:before="60" w:line="240" w:after="240"/>
+        <w:jc w:val="center"/>
+      </w:pPr>
+      <w:r>
+        <w:rPr>
+          <w:sz w:val="20"/>
+          <w:szCs w:val="20"/>
+        </w:rPr>
         <w:t xml:space="preserve">Fonte: elaborado pelos autores (2026).</w:t>
       </w:r>
     </w:p>
@@ -3000,80 +3046,53 @@
           <w:sz w:val="20"/>
           <w:szCs w:val="20"/>
         </w:rPr>
-        <w:t xml:space="preserve">Figura 9 – Staging no ar: Swagger da API</w:t>
+        <w:t xml:space="preserve">Figura 9 – Cluster AKS hidrosense-aks: monitoramento de nós e pods</w:t>
       </w:r>
     </w:p>
     <w:p>
       <w:pPr>
         <w:keepNext/>
-        <w:pBdr>
-          <w:top w:val="dashed" w:color="808080" w:sz="8" w:space="8"/>
-          <w:bottom w:val="dashed" w:color="808080" w:sz="8" w:space="8"/>
-          <w:left w:val="dashed" w:color="808080" w:sz="8" w:space="8"/>
-          <w:right w:val="dashed" w:color="808080" w:sz="8" w:space="8"/>
-        </w:pBdr>
-        <w:spacing w:line="1800" w:lineRule="exact"/>
-        <w:jc w:val="center"/>
-      </w:pPr>
-      <w:r>
-        <w:rPr>
-          <w:i/>
-          <w:iCs/>
-          <w:color w:val="808080"/>
-          <w:sz w:val="20"/>
-          <w:szCs w:val="20"/>
-        </w:rPr>
-        <w:t xml:space="preserve">[ inserir print: docs/prints/07-staging-swagger.png ]</w:t>
-      </w:r>
-    </w:p>
-    <w:p>
-      <w:pPr>
-        <w:spacing w:before="60" w:line="240" w:after="240"/>
-        <w:jc w:val="center"/>
-      </w:pPr>
-      <w:r>
-        <w:rPr>
-          <w:sz w:val="20"/>
-          <w:szCs w:val="20"/>
-        </w:rPr>
-        <w:t xml:space="preserve">Fonte: elaborado pelos autores (2026).</w:t>
-      </w:r>
-    </w:p>
-    <w:p>
-      <w:pPr>
-        <w:keepNext/>
-        <w:spacing w:before="240" w:line="240" w:after="60"/>
-        <w:jc w:val="center"/>
-      </w:pPr>
-      <w:r>
-        <w:rPr>
-          <w:sz w:val="20"/>
-          <w:szCs w:val="20"/>
-        </w:rPr>
-        <w:t xml:space="preserve">Figura 10 – Produção no ar: /health respondendo Healthy</w:t>
-      </w:r>
-    </w:p>
-    <w:p>
-      <w:pPr>
-        <w:keepNext/>
-        <w:pBdr>
-          <w:top w:val="dashed" w:color="808080" w:sz="8" w:space="8"/>
-          <w:bottom w:val="dashed" w:color="808080" w:sz="8" w:space="8"/>
-          <w:left w:val="dashed" w:color="808080" w:sz="8" w:space="8"/>
-          <w:right w:val="dashed" w:color="808080" w:sz="8" w:space="8"/>
-        </w:pBdr>
-        <w:spacing w:line="1800" w:lineRule="exact"/>
-        <w:jc w:val="center"/>
-      </w:pPr>
-      <w:r>
-        <w:rPr>
-          <w:i/>
-          <w:iCs/>
-          <w:color w:val="808080"/>
-          <w:sz w:val="20"/>
-          <w:szCs w:val="20"/>
-        </w:rPr>
-        <w:t xml:space="preserve">[ inserir print: docs/prints/08-producao-health.png ]</w:t>
+        <w:jc w:val="center"/>
+      </w:pPr>
+      <w:r>
+        <w:drawing>
+          <wp:inline distT="0" distB="0" distL="0" distR="0">
+            <wp:extent cx="5715000" cy="2914650"/>
+            <wp:effectExtent t="0" r="0" b="0" l="0"/>
+            <wp:docPr id="1" name="11-aks-monitor" descr="Cluster AKS hidrosense-aks: monitoramento de nós e pods" title="Cluster AKS hidrosense-aks: monitoramento de nós e pods"/>
+            <wp:cNvGraphicFramePr>
+              <a:graphicFrameLocks xmlns:a="http://schemas.openxmlformats.org/drawingml/2006/main" noChangeAspect="1"/>
+            </wp:cNvGraphicFramePr>
+            <a:graphic xmlns:a="http://schemas.openxmlformats.org/drawingml/2006/main">
+              <a:graphicData uri="http://schemas.openxmlformats.org/drawingml/2006/picture">
+                <pic:pic xmlns:pic="http://schemas.openxmlformats.org/drawingml/2006/picture">
+                  <pic:nvPicPr>
+                    <pic:cNvPr id="0" name="" descr=""/>
+                    <pic:cNvPicPr>
+                      <a:picLocks noChangeAspect="1" noChangeArrowheads="1"/>
+                    </pic:cNvPicPr>
+                  </pic:nvPicPr>
+                  <pic:blipFill>
+                    <a:blip r:embed="rId14" cstate="none"/>
+                    <a:srcRect/>
+                    <a:stretch>
+                      <a:fillRect/>
+                    </a:stretch>
+                  </pic:blipFill>
+                  <pic:spPr bwMode="auto">
+                    <a:xfrm>
+                      <a:off x="0" y="0"/>
+                      <a:ext cx="5715000" cy="2914650"/>
+                    </a:xfrm>
+                    <a:prstGeom prst="rect">
+                      <a:avLst/>
+                    </a:prstGeom>
+                  </pic:spPr>
+                </pic:pic>
+              </a:graphicData>
+            </a:graphic>
+          </wp:inline>
+        </w:drawing>
       </w:r>
     </w:p>
     <w:p>

</xml_diff>

<commit_message>
prints do pipeline e do deploy em producao
</commit_message>
<xml_diff>
--- a/docs/HidroSense-Documentacao.docx
+++ b/docs/HidroSense-Documentacao.docx
@@ -2600,7 +2600,7 @@
       <w:r>
         <w:drawing>
           <wp:inline distT="0" distB="0" distL="0" distR="0">
-            <wp:extent cx="5715000" cy="1981200"/>
+            <wp:extent cx="5715000" cy="2905125"/>
             <wp:effectExtent t="0" r="0" b="0" l="0"/>
             <wp:docPr id="1" name="01-pipeline" descr="Execução completa do pipeline na branch main" title="Execução completa do pipeline na branch main"/>
             <wp:cNvGraphicFramePr>
@@ -2625,7 +2625,7 @@
                   <pic:spPr bwMode="auto">
                     <a:xfrm>
                       <a:off x="0" y="0"/>
-                      <a:ext cx="5715000" cy="1981200"/>
+                      <a:ext cx="5715000" cy="2905125"/>
                     </a:xfrm>
                     <a:prstGeom prst="rect">
                       <a:avLst/>
@@ -2827,7 +2827,7 @@
           <w:sz w:val="20"/>
           <w:szCs w:val="20"/>
         </w:rPr>
-        <w:t xml:space="preserve">Figura 6 – Staging no ar: Swagger da API</w:t>
+        <w:t xml:space="preserve">Figura 6 – Deploy em produção no AKS com rollout e smoke test</w:t>
       </w:r>
     </w:p>
     <w:p>
@@ -2838,9 +2838,9 @@
       <w:r>
         <w:drawing>
           <wp:inline distT="0" distB="0" distL="0" distR="0">
-            <wp:extent cx="5715000" cy="3057525"/>
+            <wp:extent cx="5715000" cy="2981325"/>
             <wp:effectExtent t="0" r="0" b="0" l="0"/>
-            <wp:docPr id="1" name="07-staging-swagger" descr="Staging no ar: Swagger da API" title="Staging no ar: Swagger da API"/>
+            <wp:docPr id="1" name="05-deploy-producao" descr="Deploy em produção no AKS com rollout e smoke test" title="Deploy em produção no AKS com rollout e smoke test"/>
             <wp:cNvGraphicFramePr>
               <a:graphicFrameLocks xmlns:a="http://schemas.openxmlformats.org/drawingml/2006/main" noChangeAspect="1"/>
             </wp:cNvGraphicFramePr>
@@ -2863,7 +2863,7 @@
                   <pic:spPr bwMode="auto">
                     <a:xfrm>
                       <a:off x="0" y="0"/>
-                      <a:ext cx="5715000" cy="3057525"/>
+                      <a:ext cx="5715000" cy="2981325"/>
                     </a:xfrm>
                     <a:prstGeom prst="rect">
                       <a:avLst/>
@@ -2900,7 +2900,7 @@
           <w:sz w:val="20"/>
           <w:szCs w:val="20"/>
         </w:rPr>
-        <w:t xml:space="preserve">Figura 7 – Resource group hidrosense-rg em Chile Central</w:t>
+        <w:t xml:space="preserve">Figura 7 – Staging no ar: Swagger da API</w:t>
       </w:r>
     </w:p>
     <w:p>
@@ -2911,9 +2911,9 @@
       <w:r>
         <w:drawing>
           <wp:inline distT="0" distB="0" distL="0" distR="0">
-            <wp:extent cx="5715000" cy="4076700"/>
+            <wp:extent cx="5715000" cy="3057525"/>
             <wp:effectExtent t="0" r="0" b="0" l="0"/>
-            <wp:docPr id="1" name="09-azure-resource-group" descr="Resource group hidrosense-rg em Chile Central" title="Resource group hidrosense-rg em Chile Central"/>
+            <wp:docPr id="1" name="07-staging-swagger" descr="Staging no ar: Swagger da API" title="Staging no ar: Swagger da API"/>
             <wp:cNvGraphicFramePr>
               <a:graphicFrameLocks xmlns:a="http://schemas.openxmlformats.org/drawingml/2006/main" noChangeAspect="1"/>
             </wp:cNvGraphicFramePr>
@@ -2936,7 +2936,7 @@
                   <pic:spPr bwMode="auto">
                     <a:xfrm>
                       <a:off x="0" y="0"/>
-                      <a:ext cx="5715000" cy="4076700"/>
+                      <a:ext cx="5715000" cy="3057525"/>
                     </a:xfrm>
                     <a:prstGeom prst="rect">
                       <a:avLst/>
@@ -2973,7 +2973,7 @@
           <w:sz w:val="20"/>
           <w:szCs w:val="20"/>
         </w:rPr>
-        <w:t xml:space="preserve">Figura 8 – Cluster AKS hidrosense-aks: visão geral</w:t>
+        <w:t xml:space="preserve">Figura 8 – Resource group hidrosense-rg em Chile Central</w:t>
       </w:r>
     </w:p>
     <w:p>
@@ -2984,9 +2984,9 @@
       <w:r>
         <w:drawing>
           <wp:inline distT="0" distB="0" distL="0" distR="0">
-            <wp:extent cx="5715000" cy="2924175"/>
+            <wp:extent cx="5715000" cy="4076700"/>
             <wp:effectExtent t="0" r="0" b="0" l="0"/>
-            <wp:docPr id="1" name="10-aks-visao-geral" descr="Cluster AKS hidrosense-aks: visão geral" title="Cluster AKS hidrosense-aks: visão geral"/>
+            <wp:docPr id="1" name="09-azure-resource-group" descr="Resource group hidrosense-rg em Chile Central" title="Resource group hidrosense-rg em Chile Central"/>
             <wp:cNvGraphicFramePr>
               <a:graphicFrameLocks xmlns:a="http://schemas.openxmlformats.org/drawingml/2006/main" noChangeAspect="1"/>
             </wp:cNvGraphicFramePr>
@@ -3009,6 +3009,79 @@
                   <pic:spPr bwMode="auto">
                     <a:xfrm>
                       <a:off x="0" y="0"/>
+                      <a:ext cx="5715000" cy="4076700"/>
+                    </a:xfrm>
+                    <a:prstGeom prst="rect">
+                      <a:avLst/>
+                    </a:prstGeom>
+                  </pic:spPr>
+                </pic:pic>
+              </a:graphicData>
+            </a:graphic>
+          </wp:inline>
+        </w:drawing>
+      </w:r>
+    </w:p>
+    <w:p>
+      <w:pPr>
+        <w:spacing w:before="60" w:line="240" w:after="240"/>
+        <w:jc w:val="center"/>
+      </w:pPr>
+      <w:r>
+        <w:rPr>
+          <w:sz w:val="20"/>
+          <w:szCs w:val="20"/>
+        </w:rPr>
+        <w:t xml:space="preserve">Fonte: elaborado pelos autores (2026).</w:t>
+      </w:r>
+    </w:p>
+    <w:p>
+      <w:pPr>
+        <w:keepNext/>
+        <w:spacing w:before="240" w:line="240" w:after="60"/>
+        <w:jc w:val="center"/>
+      </w:pPr>
+      <w:r>
+        <w:rPr>
+          <w:sz w:val="20"/>
+          <w:szCs w:val="20"/>
+        </w:rPr>
+        <w:t xml:space="preserve">Figura 9 – Cluster AKS hidrosense-aks: visão geral</w:t>
+      </w:r>
+    </w:p>
+    <w:p>
+      <w:pPr>
+        <w:keepNext/>
+        <w:jc w:val="center"/>
+      </w:pPr>
+      <w:r>
+        <w:drawing>
+          <wp:inline distT="0" distB="0" distL="0" distR="0">
+            <wp:extent cx="5715000" cy="2924175"/>
+            <wp:effectExtent t="0" r="0" b="0" l="0"/>
+            <wp:docPr id="1" name="10-aks-visao-geral" descr="Cluster AKS hidrosense-aks: visão geral" title="Cluster AKS hidrosense-aks: visão geral"/>
+            <wp:cNvGraphicFramePr>
+              <a:graphicFrameLocks xmlns:a="http://schemas.openxmlformats.org/drawingml/2006/main" noChangeAspect="1"/>
+            </wp:cNvGraphicFramePr>
+            <a:graphic xmlns:a="http://schemas.openxmlformats.org/drawingml/2006/main">
+              <a:graphicData uri="http://schemas.openxmlformats.org/drawingml/2006/picture">
+                <pic:pic xmlns:pic="http://schemas.openxmlformats.org/drawingml/2006/picture">
+                  <pic:nvPicPr>
+                    <pic:cNvPr id="0" name="" descr=""/>
+                    <pic:cNvPicPr>
+                      <a:picLocks noChangeAspect="1" noChangeArrowheads="1"/>
+                    </pic:cNvPicPr>
+                  </pic:nvPicPr>
+                  <pic:blipFill>
+                    <a:blip r:embed="rId14" cstate="none"/>
+                    <a:srcRect/>
+                    <a:stretch>
+                      <a:fillRect/>
+                    </a:stretch>
+                  </pic:blipFill>
+                  <pic:spPr bwMode="auto">
+                    <a:xfrm>
+                      <a:off x="0" y="0"/>
                       <a:ext cx="5715000" cy="2924175"/>
                     </a:xfrm>
                     <a:prstGeom prst="rect">
@@ -3046,7 +3119,7 @@
           <w:sz w:val="20"/>
           <w:szCs w:val="20"/>
         </w:rPr>
-        <w:t xml:space="preserve">Figura 9 – Cluster AKS hidrosense-aks: monitoramento de nós e pods</w:t>
+        <w:t xml:space="preserve">Figura 10 – Cluster AKS hidrosense-aks: monitoramento de nós e pods</w:t>
       </w:r>
     </w:p>
     <w:p>
@@ -3073,7 +3146,7 @@
                     </pic:cNvPicPr>
                   </pic:nvPicPr>
                   <pic:blipFill>
-                    <a:blip r:embed="rId14" cstate="none"/>
+                    <a:blip r:embed="rId15" cstate="none"/>
                     <a:srcRect/>
                     <a:stretch>
                       <a:fillRect/>

</xml_diff>